<commit_message>
feat: tokenize ciudad, provincia, date, and firma in compromiso etico
Replaces underscore placeholders with auto-filled tokens:
- ciudad: Santo Domingo, provincia: Distrito Nacional
- Full date in words (dia, mes, anio with letter equivalents)
- Firma image replaces underscore signature line

Co-Authored-By: Claude Opus 4.6 <noreply@anthropic.com>
</commit_message>
<xml_diff>
--- a/resources/form_templates/estandar/compromiso-etico-de-proveedores.docx
+++ b/resources/form_templates/estandar/compromiso-etico-de-proveedores.docx
@@ -672,24 +672,6 @@
       </w:pPr>
       <w:r>
         <w:rPr>
-          <w:rFonts w:ascii="Book Antiqua" w:hAnsi="Book Antiqua"/>
-          <w:sz w:val="23"/>
-          <w:szCs w:val="23"/>
-          <w:lang w:val="es-ES"/>
-        </w:rPr>
-        <w:t xml:space="preserve">La presente declaración ha sido realizada en la ciudad </w:t>
-      </w:r>
-      <w:r>
-        <w:rPr>
-          <w:rFonts w:ascii="Book Antiqua" w:hAnsi="Book Antiqua"/>
-          <w:sz w:val="23"/>
-          <w:szCs w:val="23"/>
-          <w:lang w:val="es-ES"/>
-        </w:rPr>
-        <w:t>_____</w:t>
-      </w:r>
-      <w:r>
-        <w:rPr>
           <w:rFonts w:ascii="Book Antiqua" w:eastAsia="Times New Roman" w:hAnsi="Book Antiqua" w:cs="Times New Roman"/>
           <w:color w:val="212121"/>
           <w:sz w:val="23"/>
@@ -697,18 +679,13 @@
           <w:shd w:val="clear" w:color="auto" w:fill="FFFFFF"/>
           <w:lang w:val="es-DO" w:eastAsia="es-ES_tradnl"/>
         </w:rPr>
-        <w:t xml:space="preserve">___________________, provincia </w:t>
-      </w:r>
-      <w:r>
-        <w:rPr>
-          <w:rFonts w:ascii="Book Antiqua" w:hAnsi="Book Antiqua"/>
-          <w:sz w:val="23"/>
-          <w:szCs w:val="23"/>
-          <w:lang w:val="es-ES"/>
-        </w:rPr>
-        <w:t>_____</w:t>
-      </w:r>
-      <w:r>
+        <w:t xml:space="preserve">La presente declaración ha sido realizada en la ciudad ${ciudad}, provincia ${provincia}, a los ${dia} (${dia_letras}) de ${mes} del año ${anio} (${anio_letras}).</w:t>
+      </w:r>
+    </w:p>
+    <w:p>
+      <w:pPr>
+        <w:spacing w:after="0" w:line="240" w:lineRule="auto"/>
+        <w:jc w:val="both"/>
         <w:rPr>
           <w:rFonts w:ascii="Book Antiqua" w:eastAsia="Times New Roman" w:hAnsi="Book Antiqua" w:cs="Times New Roman"/>
           <w:color w:val="212121"/>
@@ -717,138 +694,6 @@
           <w:shd w:val="clear" w:color="auto" w:fill="FFFFFF"/>
           <w:lang w:val="es-DO" w:eastAsia="es-ES_tradnl"/>
         </w:rPr>
-        <w:t>___________________</w:t>
-      </w:r>
-      <w:r>
-        <w:rPr>
-          <w:rFonts w:ascii="Book Antiqua" w:eastAsia="Times New Roman" w:hAnsi="Book Antiqua" w:cs="Times New Roman"/>
-          <w:color w:val="212121"/>
-          <w:sz w:val="23"/>
-          <w:szCs w:val="23"/>
-          <w:shd w:val="clear" w:color="auto" w:fill="FFFFFF"/>
-          <w:lang w:val="es-DO" w:eastAsia="es-ES_tradnl"/>
-        </w:rPr>
-        <w:t xml:space="preserve">, a los </w:t>
-      </w:r>
-      <w:r>
-        <w:rPr>
-          <w:rFonts w:ascii="Book Antiqua" w:hAnsi="Book Antiqua"/>
-          <w:sz w:val="23"/>
-          <w:szCs w:val="23"/>
-          <w:lang w:val="es-ES"/>
-        </w:rPr>
-        <w:t>_____</w:t>
-      </w:r>
-      <w:r>
-        <w:rPr>
-          <w:rFonts w:ascii="Book Antiqua" w:eastAsia="Times New Roman" w:hAnsi="Book Antiqua" w:cs="Times New Roman"/>
-          <w:color w:val="212121"/>
-          <w:sz w:val="23"/>
-          <w:szCs w:val="23"/>
-          <w:shd w:val="clear" w:color="auto" w:fill="FFFFFF"/>
-          <w:lang w:val="es-DO" w:eastAsia="es-ES_tradnl"/>
-        </w:rPr>
-        <w:t>___________________</w:t>
-      </w:r>
-      <w:r>
-        <w:rPr>
-          <w:rFonts w:ascii="Book Antiqua" w:eastAsia="Times New Roman" w:hAnsi="Book Antiqua" w:cs="Times New Roman"/>
-          <w:color w:val="212121"/>
-          <w:sz w:val="23"/>
-          <w:szCs w:val="23"/>
-          <w:shd w:val="clear" w:color="auto" w:fill="FFFFFF"/>
-          <w:lang w:val="es-DO" w:eastAsia="es-ES_tradnl"/>
-        </w:rPr>
-        <w:t xml:space="preserve"> (</w:t>
-      </w:r>
-      <w:r>
-        <w:rPr>
-          <w:rFonts w:ascii="Book Antiqua" w:eastAsia="Times New Roman" w:hAnsi="Book Antiqua" w:cs="Times New Roman"/>
-          <w:color w:val="212121"/>
-          <w:sz w:val="23"/>
-          <w:szCs w:val="23"/>
-          <w:shd w:val="clear" w:color="auto" w:fill="FFFFFF"/>
-          <w:lang w:val="es-DO" w:eastAsia="es-ES_tradnl"/>
-        </w:rPr>
-        <w:t>________</w:t>
-      </w:r>
-      <w:r>
-        <w:rPr>
-          <w:rFonts w:ascii="Book Antiqua" w:eastAsia="Times New Roman" w:hAnsi="Book Antiqua" w:cs="Times New Roman"/>
-          <w:color w:val="212121"/>
-          <w:sz w:val="23"/>
-          <w:szCs w:val="23"/>
-          <w:shd w:val="clear" w:color="auto" w:fill="FFFFFF"/>
-          <w:lang w:val="es-DO" w:eastAsia="es-ES_tradnl"/>
-        </w:rPr>
-        <w:t xml:space="preserve">) de </w:t>
-      </w:r>
-      <w:r>
-        <w:rPr>
-          <w:rFonts w:ascii="Book Antiqua" w:hAnsi="Book Antiqua"/>
-          <w:sz w:val="23"/>
-          <w:szCs w:val="23"/>
-          <w:lang w:val="es-ES"/>
-        </w:rPr>
-        <w:t>_____</w:t>
-      </w:r>
-      <w:r>
-        <w:rPr>
-          <w:rFonts w:ascii="Book Antiqua" w:eastAsia="Times New Roman" w:hAnsi="Book Antiqua" w:cs="Times New Roman"/>
-          <w:color w:val="212121"/>
-          <w:sz w:val="23"/>
-          <w:szCs w:val="23"/>
-          <w:shd w:val="clear" w:color="auto" w:fill="FFFFFF"/>
-          <w:lang w:val="es-DO" w:eastAsia="es-ES_tradnl"/>
-        </w:rPr>
-        <w:t>___________________</w:t>
-      </w:r>
-      <w:r>
-        <w:rPr>
-          <w:rFonts w:ascii="Book Antiqua" w:eastAsia="Times New Roman" w:hAnsi="Book Antiqua" w:cs="Times New Roman"/>
-          <w:color w:val="212121"/>
-          <w:sz w:val="23"/>
-          <w:szCs w:val="23"/>
-          <w:shd w:val="clear" w:color="auto" w:fill="FFFFFF"/>
-          <w:lang w:val="es-DO" w:eastAsia="es-ES_tradnl"/>
-        </w:rPr>
-        <w:t xml:space="preserve"> del año ______________________________________</w:t>
-      </w:r>
-      <w:r>
-        <w:rPr>
-          <w:rFonts w:ascii="Book Antiqua" w:eastAsia="Times New Roman" w:hAnsi="Book Antiqua" w:cs="Times New Roman"/>
-          <w:color w:val="212121"/>
-          <w:sz w:val="23"/>
-          <w:szCs w:val="23"/>
-          <w:shd w:val="clear" w:color="auto" w:fill="FFFFFF"/>
-          <w:lang w:val="es-DO" w:eastAsia="es-ES_tradnl"/>
-        </w:rPr>
-        <w:t xml:space="preserve"> (__________)</w:t>
-      </w:r>
-      <w:r>
-        <w:rPr>
-          <w:rFonts w:ascii="Book Antiqua" w:eastAsia="Times New Roman" w:hAnsi="Book Antiqua" w:cs="Times New Roman"/>
-          <w:color w:val="212121"/>
-          <w:sz w:val="23"/>
-          <w:szCs w:val="23"/>
-          <w:shd w:val="clear" w:color="auto" w:fill="FFFFFF"/>
-          <w:lang w:val="es-DO" w:eastAsia="es-ES_tradnl"/>
-        </w:rPr>
-        <w:t>.</w:t>
-      </w:r>
-    </w:p>
-    <w:p>
-      <w:pPr>
-        <w:spacing w:after="0" w:line="240" w:lineRule="auto"/>
-        <w:jc w:val="both"/>
-        <w:rPr>
-          <w:rFonts w:ascii="Book Antiqua" w:eastAsia="Times New Roman" w:hAnsi="Book Antiqua" w:cs="Times New Roman"/>
-          <w:color w:val="212121"/>
-          <w:sz w:val="23"/>
-          <w:szCs w:val="23"/>
-          <w:shd w:val="clear" w:color="auto" w:fill="FFFFFF"/>
-          <w:lang w:val="es-DO" w:eastAsia="es-ES_tradnl"/>
-        </w:rPr>
       </w:pPr>
     </w:p>
     <w:p>
@@ -869,7 +714,7 @@
           <w:szCs w:val="23"/>
           <w:lang w:val="es-DO"/>
         </w:rPr>
-        <w:t>_________________________________</w:t>
+        <w:t>${img_firma}</w:t>
       </w:r>
     </w:p>
     <w:p>

</xml_diff>